<commit_message>
Add Market Research Agent project; refresh resume
Co-Authored-By: Claude Opus 4.8 <noreply@anthropic.com>
</commit_message>
<xml_diff>
--- a/Mykola_Golovko_Resume.docx
+++ b/Mykola_Golovko_Resume.docx
@@ -272,6 +272,25 @@
           <w:szCs w:val="21"/>
         </w:rPr>
         <w:t xml:space="preserve">AI Strategy &amp; Organizational Intelligence:</w:t>
+      </w:r>
+    </w:p>
+    <w:p>
+      <w:pPr>
+        <w:pStyle w:val="ListParagraph"/>
+        <w:numPr>
+          <w:ilvl w:val="0"/>
+          <w:numId w:val="2"/>
+        </w:numPr>
+        <w:spacing w:after="30" w:before="30"/>
+      </w:pPr>
+      <w:r>
+        <w:rPr>
+          <w:rFonts w:ascii="Arial" w:cs="Arial" w:eastAsia="Arial" w:hAnsi="Arial"/>
+          <w:color w:val="222222"/>
+          <w:sz w:val="21"/>
+          <w:szCs w:val="21"/>
+        </w:rPr>
+        <w:t xml:space="preserve">Architected and deployed a production multi-agent research swarm on Claude Code—a coordinator dispatching specialized sub-agents across the full market-research lifecycle: source identification, top-down and bottom-up estimation, cross-source reconciliation, data-quality validation, and client-ready deliverables. Built to retarget across industries by swapping specification inputs, now running end-to-end on live market builds.</w:t>
       </w:r>
     </w:p>
     <w:p>

</xml_diff>